<commit_message>
The Price of De-correlation: Quantifying the Agreement–Cost Trade-off in Heterogeneous Large Language Model Ensembles
</commit_message>
<xml_diff>
--- a/paper/paper_ieee_access.docx
+++ b/paper/paper_ieee_access.docx
@@ -2587,18 +2587,7 @@
         <w:t xml:space="preserve"> </w:t>
       </w:r>
       <w:r>
-        <w:t xml:space="preserve">Section </w:t>
-      </w:r>
-      <w:hyperlink w:anchor="sec:prereg">
-        <w:r>
-          <w:rPr>
-            <w:rStyle w:val="Hyperlink"/>
-          </w:rPr>
-          <w:t xml:space="preserve">4.4</w:t>
-        </w:r>
-      </w:hyperlink>
-      <w:r>
-        <w:t xml:space="preserve">.</w:t>
+        <w:t xml:space="preserve">Section IV-D.</w:t>
       </w:r>
     </w:p>
     <w:p>
@@ -2972,18 +2961,7 @@
         <w:t xml:space="preserve"> </w:t>
       </w:r>
       <w:r>
-        <w:t xml:space="preserve">collection are reported in Table </w:t>
-      </w:r>
-      <w:hyperlink w:anchor="tab:models">
-        <w:r>
-          <w:rPr>
-            <w:rStyle w:val="Hyperlink"/>
-          </w:rPr>
-          <w:t xml:space="preserve">1</w:t>
-        </w:r>
-      </w:hyperlink>
-      <w:r>
-        <w:t xml:space="preserve">.</w:t>
+        <w:t xml:space="preserve">collection are reported in Table 1.</w:t>
       </w:r>
     </w:p>
     <w:bookmarkStart w:id="29" w:name="tab:models"/>
@@ -2991,6 +2969,15 @@
       <w:pPr>
         <w:pStyle w:val="TableCaption"/>
       </w:pPr>
+      <w:r>
+        <w:rPr>
+          <w:b/>
+        </w:rPr>
+        <w:t xml:space="preserve">TABLE 1.</w:t>
+      </w:r>
+      <w:r>
+        <w:t xml:space="preserve"> </w:t>
+      </w:r>
       <w:r>
         <w:t xml:space="preserve">Model registry (verified via a live probe). Prices are USD per</w:t>
       </w:r>
@@ -3023,7 +3010,7 @@
         <w:tblStyle w:val="Table"/>
         <w:tblW w:type="pct" w:w="0.0"/>
         <w:tblLook w:firstRow="1"/>
-        <w:tblCaption w:val="Model registry (verified via a live probe). Prices are USD per 10^6 tokens at time of experiment."/>
+        <w:tblCaption w:val="TABLE 1. Model registry (verified via a live probe). Prices are USD per 10^6 tokens at time of experiment."/>
       </w:tblPr>
       <w:tblGrid/>
       <w:tr>
@@ -4534,18 +4521,7 @@
         <w:t xml:space="preserve"> </w:t>
       </w:r>
       <w:r>
-        <w:t xml:space="preserve">responses (Section </w:t>
-      </w:r>
-      <w:hyperlink w:anchor="sec:prereg">
-        <w:r>
-          <w:rPr>
-            <w:rStyle w:val="Hyperlink"/>
-          </w:rPr>
-          <w:t xml:space="preserve">4.4</w:t>
-        </w:r>
-      </w:hyperlink>
-      <w:r>
-        <w:t xml:space="preserve">) in addition to re-executable seeding.</w:t>
+        <w:t xml:space="preserve">responses (Section IV-D) in addition to re-executable seeding.</w:t>
       </w:r>
     </w:p>
     <w:p>
@@ -5731,18 +5707,7 @@
         <w:t xml:space="preserve"> </w:t>
       </w:r>
       <w:r>
-        <w:t xml:space="preserve">in Table </w:t>
-      </w:r>
-      <w:hyperlink w:anchor="tab:models">
-        <w:r>
-          <w:rPr>
-            <w:rStyle w:val="Hyperlink"/>
-          </w:rPr>
-          <w:t xml:space="preserve">1</w:t>
-        </w:r>
-      </w:hyperlink>
-      <w:r>
-        <w:t xml:space="preserve">, together with their roles in each ensemble</w:t>
+        <w:t xml:space="preserve">in Table 1, together with their roles in each ensemble</w:t>
       </w:r>
       <w:r>
         <w:t xml:space="preserve"> </w:t>
@@ -5766,18 +5731,7 @@
         <w:t xml:space="preserve"> </w:t>
       </w:r>
       <w:r>
-        <w:t xml:space="preserve">Section </w:t>
-      </w:r>
-      <w:hyperlink w:anchor="sec:estimand">
-        <w:r>
-          <w:rPr>
-            <w:rStyle w:val="Hyperlink"/>
-          </w:rPr>
-          <w:t xml:space="preserve">3.3</w:t>
-        </w:r>
-      </w:hyperlink>
-      <w:r>
-        <w:t xml:space="preserve">. Apart from the model and provider assignments</w:t>
+        <w:t xml:space="preserve">Section III-C. Apart from the model and provider assignments</w:t>
       </w:r>
       <w:r>
         <w:t xml:space="preserve"> </w:t>
@@ -5847,6 +5801,15 @@
       <w:pPr>
         <w:pStyle w:val="TableCaption"/>
       </w:pPr>
+      <w:r>
+        <w:rPr>
+          <w:b/>
+        </w:rPr>
+        <w:t xml:space="preserve">TABLE 2.</w:t>
+      </w:r>
+      <w:r>
+        <w:t xml:space="preserve"> </w:t>
+      </w:r>
       <w:r>
         <w:t xml:space="preserve">Primary and secondary</w:t>
       </w:r>
@@ -5885,7 +5848,7 @@
         <w:tblStyle w:val="Table"/>
         <w:tblW w:type="pct" w:w="0.0"/>
         <w:tblLook w:firstRow="1"/>
-        <w:tblCaption w:val="Primary and secondary \Delta\kappa (cluster bootstrap over equities, 2,000 draws, seed 42)."/>
+        <w:tblCaption w:val="TABLE 2. Primary and secondary \Delta\kappa (cluster bootstrap over equities, 2,000 draws, seed 42)."/>
       </w:tblPr>
       <w:tblGrid/>
       <w:tr>
@@ -6386,38 +6349,13 @@
         <w:t xml:space="preserve"> </w:t>
       </w:r>
       <w:r>
-        <w:t xml:space="preserve">and 0.215 for HET, as reported in Table </w:t>
-      </w:r>
-      <w:hyperlink w:anchor="tab:frontier">
-        <w:r>
-          <w:rPr>
-            <w:rStyle w:val="Hyperlink"/>
-          </w:rPr>
-          <w:t xml:space="preserve">4</w:t>
-        </w:r>
-      </w:hyperlink>
-      <w:r>
-        <w:t xml:space="preserve"> </w:t>
-      </w:r>
-      <w:r>
-        <w:t xml:space="preserve">and illustrated in</w:t>
-      </w:r>
-      <w:r>
-        <w:t xml:space="preserve"> </w:t>
-      </w:r>
-      <w:r>
-        <w:t xml:space="preserve">Fig. </w:t>
-      </w:r>
-      <w:hyperlink w:anchor="fig:frontier">
-        <w:r>
-          <w:rPr>
-            <w:rStyle w:val="Hyperlink"/>
-          </w:rPr>
-          <w:t xml:space="preserve">1</w:t>
-        </w:r>
-      </w:hyperlink>
-      <w:r>
-        <w:t xml:space="preserve">. Using the unrounded configuration-level estimates, the</w:t>
+        <w:t xml:space="preserve">and 0.215 for HET, as reported in Table 4 and illustrated in</w:t>
+      </w:r>
+      <w:r>
+        <w:t xml:space="preserve"> </w:t>
+      </w:r>
+      <w:r>
+        <w:t xml:space="preserve">Fig. 1. Using the unrounded configuration-level estimates, the</w:t>
       </w:r>
       <w:r>
         <w:t xml:space="preserve"> </w:t>
@@ -6655,18 +6593,7 @@
         <w:t xml:space="preserve"> </w:t>
       </w:r>
       <w:r>
-        <w:t xml:space="preserve">confidence intervals excluding zero (Table </w:t>
-      </w:r>
-      <w:hyperlink w:anchor="tab:endpoints">
-        <w:r>
-          <w:rPr>
-            <w:rStyle w:val="Hyperlink"/>
-          </w:rPr>
-          <w:t xml:space="preserve">2</w:t>
-        </w:r>
-      </w:hyperlink>
-      <w:r>
-        <w:t xml:space="preserve">). Agreement</w:t>
+        <w:t xml:space="preserve">confidence intervals excluding zero (Table 2). Agreement</w:t>
       </w:r>
       <w:r>
         <w:t xml:space="preserve"> </w:t>
@@ -6703,7 +6630,7 @@
           <wp:inline>
             <wp:extent cx="5334000" cy="3733799"/>
             <wp:effectExtent b="0" l="0" r="0" t="0"/>
-            <wp:docPr descr="Agreement–cost frontier. Within-ensemble Fleiss’ \kappa (y) versus cost per ensemble decision (x) at heterogeneity levels \{0, 1, 3\}. Lower \kappa indicates lower observed within-ensemble agreement; the horizontal spread is the cost premium." title="" id="1" name="Picture"/>
+            <wp:docPr descr="FIGURE 1. Agreement–cost frontier. Within-ensemble Fleiss’ \kappa (y) versus cost per ensemble decision (x) at heterogeneity levels \{0, 1, 3\}. Lower \kappa indicates lower observed within-ensemble agreement; the horizontal spread is the cost premium." title="" id="1" name="Picture"/>
             <a:graphic>
               <a:graphicData uri="http://schemas.openxmlformats.org/drawingml/2006/picture">
                 <pic:pic>
@@ -6747,6 +6674,15 @@
         <w:pStyle w:val="ImageCaption"/>
       </w:pPr>
       <w:r>
+        <w:rPr>
+          <w:b/>
+        </w:rPr>
+        <w:t xml:space="preserve">FIGURE 1.</w:t>
+      </w:r>
+      <w:r>
+        <w:t xml:space="preserve"> </w:t>
+      </w:r>
+      <w:r>
         <w:t xml:space="preserve">Agreement–cost frontier. Within-ensemble Fleiss’</w:t>
       </w:r>
       <w:r>
@@ -6968,18 +6904,7 @@
         <w:t xml:space="preserve"> </w:t>
       </w:r>
       <w:r>
-        <w:t xml:space="preserve">HET (Table </w:t>
-      </w:r>
-      <w:hyperlink w:anchor="tab:stats">
-        <w:r>
-          <w:rPr>
-            <w:rStyle w:val="Hyperlink"/>
-          </w:rPr>
-          <w:t xml:space="preserve">3</w:t>
-        </w:r>
-      </w:hyperlink>
-      <w:r>
-        <w:t xml:space="preserve">).</w:t>
+        <w:t xml:space="preserve">HET (Table 3).</w:t>
       </w:r>
       <w:r>
         <w:t xml:space="preserve"> </w:t>
@@ -7042,6 +6967,15 @@
       <w:pPr>
         <w:pStyle w:val="TableCaption"/>
       </w:pPr>
+      <w:r>
+        <w:rPr>
+          <w:b/>
+        </w:rPr>
+        <w:t xml:space="preserve">TABLE 3.</w:t>
+      </w:r>
+      <w:r>
+        <w:t xml:space="preserve"> </w:t>
+      </w:r>
       <w:r>
         <w:t xml:space="preserve">Agreement under three statistics (per-run averaged), with the</w:t>
       </w:r>
@@ -7063,7 +6997,7 @@
         <w:tblStyle w:val="Table"/>
         <w:tblW w:type="pct" w:w="0.0"/>
         <w:tblLook w:firstRow="0"/>
-        <w:tblCaption w:val="Agreement under three statistics (per-run averaged), with the per-config directional marginals. All three statistics agree on the ordering despite the prevalence shift in HOLD."/>
+        <w:tblCaption w:val="TABLE 3. Agreement under three statistics (per-run averaged), with the per-config directional marginals. All three statistics agree on the ordering despite the prevalence shift in HOLD."/>
       </w:tblPr>
       <w:tblGrid/>
       <w:tr>
@@ -7432,6 +7366,15 @@
         <w:pStyle w:val="TableCaption"/>
       </w:pPr>
       <w:r>
+        <w:rPr>
+          <w:b/>
+        </w:rPr>
+        <w:t xml:space="preserve">TABLE 4.</w:t>
+      </w:r>
+      <w:r>
+        <w:t xml:space="preserve"> </w:t>
+      </w:r>
+      <w:r>
         <w:t xml:space="preserve">Frontier: within-ensemble agreement and cost by heterogeneity level.</w:t>
       </w:r>
     </w:p>
@@ -7440,7 +7383,7 @@
         <w:tblStyle w:val="Table"/>
         <w:tblW w:type="pct" w:w="0.0"/>
         <w:tblLook w:firstRow="1"/>
-        <w:tblCaption w:val="Frontier: within-ensemble agreement and cost by heterogeneity level."/>
+        <w:tblCaption w:val="TABLE 4. Frontier: within-ensemble agreement and cost by heterogeneity level."/>
       </w:tblPr>
       <w:tblGrid/>
       <w:tr>
@@ -7869,32 +7812,7 @@
         <w:t xml:space="preserve"> </w:t>
       </w:r>
       <w:r>
-        <w:t xml:space="preserve">(Table </w:t>
-      </w:r>
-      <w:hyperlink w:anchor="tab:frontier">
-        <w:r>
-          <w:rPr>
-            <w:rStyle w:val="Hyperlink"/>
-          </w:rPr>
-          <w:t xml:space="preserve">4</w:t>
-        </w:r>
-      </w:hyperlink>
-      <w:r>
-        <w:t xml:space="preserve">). Fig. </w:t>
-      </w:r>
-      <w:hyperlink w:anchor="fig:frontier">
-        <w:r>
-          <w:rPr>
-            <w:rStyle w:val="Hyperlink"/>
-          </w:rPr>
-          <w:t xml:space="preserve">1</w:t>
-        </w:r>
-      </w:hyperlink>
-      <w:r>
-        <w:t xml:space="preserve"> </w:t>
-      </w:r>
-      <w:r>
-        <w:t xml:space="preserve">presents</w:t>
+        <w:t xml:space="preserve">(Table 4). Fig. 1 presents</w:t>
       </w:r>
       <w:r>
         <w:t xml:space="preserve"> </w:t>
@@ -7994,18 +7912,7 @@
         <w:t xml:space="preserve"> </w:t>
       </w:r>
       <w:r>
-        <w:t xml:space="preserve">configuration, equity, date, and agent position (Fig. </w:t>
-      </w:r>
-      <w:hyperlink w:anchor="fig:seed">
-        <w:r>
-          <w:rPr>
-            <w:rStyle w:val="Hyperlink"/>
-          </w:rPr>
-          <w:t xml:space="preserve">[fig:seed]</w:t>
-        </w:r>
-      </w:hyperlink>
-      <w:r>
-        <w:t xml:space="preserve">). The</w:t>
+        <w:t xml:space="preserve">configuration, equity, date, and agent position (Fig. 2). The</w:t>
       </w:r>
       <w:r>
         <w:t xml:space="preserve"> </w:t>
@@ -8123,6 +8030,30 @@
     </w:p>
     <w:p>
       <w:pPr>
+        <w:pStyle w:val="FirstParagraph"/>
+      </w:pPr>
+      <w:r>
+        <w:rPr>
+          <w:b/>
+          <w:b/>
+        </w:rPr>
+        <w:t xml:space="preserve">FIGURE 2.</w:t>
+      </w:r>
+      <w:r>
+        <w:rPr>
+          <w:b/>
+        </w:rPr>
+        <w:t xml:space="preserve"> </w:t>
+      </w:r>
+      <w:r>
+        <w:rPr>
+          <w:b/>
+        </w:rPr>
+        <w:t xml:space="preserve">The one-line fix. The pilot derived the seed per run, so all five same-model agents shared a sampling path; the study derives a distinct integer-safe seed per agent, restoring independent draws from the same model.</w:t>
+      </w:r>
+    </w:p>
+    <w:p>
+      <w:pPr>
         <w:pStyle w:val="Heading4"/>
       </w:pPr>
       <w:bookmarkStart w:id="49" w:name="ruling-out-adjacent-explanations"/>
@@ -8190,18 +8121,7 @@
         <w:t xml:space="preserve"> </w:t>
       </w:r>
       <w:r>
-        <w:t xml:space="preserve">agreement (Table </w:t>
-      </w:r>
-      <w:hyperlink w:anchor="tab:nondet">
-        <w:r>
-          <w:rPr>
-            <w:rStyle w:val="Hyperlink"/>
-          </w:rPr>
-          <w:t xml:space="preserve">5</w:t>
-        </w:r>
-      </w:hyperlink>
-      <w:r>
-        <w:t xml:space="preserve">). After adopting unique per-agent seeds, the</w:t>
+        <w:t xml:space="preserve">agreement (Table 5). After adopting unique per-agent seeds, the</w:t>
       </w:r>
       <w:r>
         <w:t xml:space="preserve"> </w:t>
@@ -8243,18 +8163,7 @@
         <w:t xml:space="preserve"> </w:t>
       </w:r>
       <w:r>
-        <w:t xml:space="preserve">(Fig. </w:t>
-      </w:r>
-      <w:hyperlink w:anchor="fig:trap">
-        <w:r>
-          <w:rPr>
-            <w:rStyle w:val="Hyperlink"/>
-          </w:rPr>
-          <w:t xml:space="preserve">2</w:t>
-        </w:r>
-      </w:hyperlink>
-      <w:r>
-        <w:t xml:space="preserve">). The pilot grid comprised 8 equities</w:t>
+        <w:t xml:space="preserve">(Fig. 3). The pilot grid comprised 8 equities</w:t>
       </w:r>
       <w:r>
         <w:t xml:space="preserve"> </w:t>
@@ -8415,6 +8324,15 @@
       <w:pPr>
         <w:pStyle w:val="TableCaption"/>
       </w:pPr>
+      <w:r>
+        <w:rPr>
+          <w:b/>
+        </w:rPr>
+        <w:t xml:space="preserve">TABLE 5.</w:t>
+      </w:r>
+      <w:r>
+        <w:t xml:space="preserve"> </w:t>
+      </w:r>
       <w:r>
         <w:t xml:space="preserve">Non-determinism check: within-run vs. cross-run</w:t>
       </w:r>
@@ -8455,7 +8373,7 @@
         <w:tblStyle w:val="Table"/>
         <w:tblW w:type="pct" w:w="0.0"/>
         <w:tblLook w:firstRow="1"/>
-        <w:tblCaption w:val="Non-determinism check: within-run vs. cross-run \kappa (must be \approx 0 for the primary/homogeneous configuration)."/>
+        <w:tblCaption w:val="TABLE 5. Non-determinism check: within-run vs. cross-run \kappa (must be \approx 0 for the primary/homogeneous configuration)."/>
       </w:tblPr>
       <w:tblGrid/>
       <w:tr>
@@ -8704,7 +8622,7 @@
           <wp:inline>
             <wp:extent cx="5334000" cy="3733799"/>
             <wp:effectExtent b="0" l="0" r="0" t="0"/>
-            <wp:docPr descr="Shared-seed dependence inflates measured agreement. The homogeneous within-cross \kappa gap collapses from a seed-shared pilot (\Delta\kappa=0.485) to the independent-draw pilot (\Delta\kappa=0.113) to \approx 0 in the full study, showing that shared-seed dependence in the pilot, not model similarity, produced the inflation." title="" id="1" name="Picture"/>
+            <wp:docPr descr="FIGURE 3. Shared-seed dependence inflates measured agreement. The homogeneous within-cross \kappa gap collapses from a seed-shared pilot (\Delta\kappa=0.485) to the independent-draw pilot (\Delta\kappa=0.113) to \approx 0 in the full study, showing that shared-seed dependence in the pilot, not model similarity, produced the inflation." title="" id="1" name="Picture"/>
             <a:graphic>
               <a:graphicData uri="http://schemas.openxmlformats.org/drawingml/2006/picture">
                 <pic:pic>
@@ -8748,6 +8666,15 @@
         <w:pStyle w:val="ImageCaption"/>
       </w:pPr>
       <w:r>
+        <w:rPr>
+          <w:b/>
+        </w:rPr>
+        <w:t xml:space="preserve">FIGURE 3.</w:t>
+      </w:r>
+      <w:r>
+        <w:t xml:space="preserve"> </w:t>
+      </w:r>
+      <w:r>
         <w:t xml:space="preserve">Shared-seed dependence inflates measured agreement. The homogeneous</w:t>
       </w:r>
       <w:r>
@@ -8857,21 +8784,7 @@
         <w:pStyle w:val="FirstParagraph"/>
       </w:pPr>
       <w:r>
-        <w:t xml:space="preserve">The pairwise directional-agreement matrix in Fig. </w:t>
-      </w:r>
-      <w:hyperlink w:anchor="fig:provider">
-        <w:r>
-          <w:rPr>
-            <w:rStyle w:val="Hyperlink"/>
-          </w:rPr>
-          <w:t xml:space="preserve">3</w:t>
-        </w:r>
-      </w:hyperlink>
-      <w:r>
-        <w:t xml:space="preserve"> </w:t>
-      </w:r>
-      <w:r>
-        <w:t xml:space="preserve">provides</w:t>
+        <w:t xml:space="preserve">The pairwise directional-agreement matrix in Fig. 4 provides</w:t>
       </w:r>
       <w:r>
         <w:t xml:space="preserve"> </w:t>
@@ -8932,7 +8845,7 @@
           <wp:inline>
             <wp:extent cx="4389120" cy="3840479"/>
             <wp:effectExtent b="0" l="0" r="0" t="0"/>
-            <wp:docPr descr="Pairwise directional-agreement matrix by provider. Diagonal (within-provider) agreement greatly exceeds off-diagonal (cross-provider), the source of ensemble de-correlation. The xAI–xAI diagonal is undefined (marked N/A, not 0): each HET cell contains a single xAI agent, so no within-xAI agent pair exists." title="" id="1" name="Picture"/>
+            <wp:docPr descr="FIGURE 4. Pairwise directional-agreement matrix by provider. Diagonal (within-provider) agreement greatly exceeds off-diagonal (cross-provider), the source of ensemble de-correlation. The xAI–xAI diagonal is undefined (marked N/A, not 0): each HET cell contains a single xAI agent, so no within-xAI agent pair exists." title="" id="1" name="Picture"/>
             <a:graphic>
               <a:graphicData uri="http://schemas.openxmlformats.org/drawingml/2006/picture">
                 <pic:pic>
@@ -8976,6 +8889,15 @@
         <w:pStyle w:val="ImageCaption"/>
       </w:pPr>
       <w:r>
+        <w:rPr>
+          <w:b/>
+        </w:rPr>
+        <w:t xml:space="preserve">FIGURE 4.</w:t>
+      </w:r>
+      <w:r>
+        <w:t xml:space="preserve"> </w:t>
+      </w:r>
+      <w:r>
         <w:t xml:space="preserve">Pairwise directional-agreement matrix by provider. Diagonal</w:t>
       </w:r>
       <w:r>
@@ -9042,18 +8964,7 @@
         <w:t xml:space="preserve"> </w:t>
       </w:r>
       <w:r>
-        <w:t xml:space="preserve">0.463 for HET-LITE, and 0.488 for HET (Table </w:t>
-      </w:r>
-      <w:hyperlink w:anchor="tab:acc">
-        <w:r>
-          <w:rPr>
-            <w:rStyle w:val="Hyperlink"/>
-          </w:rPr>
-          <w:t xml:space="preserve">6</w:t>
-        </w:r>
-      </w:hyperlink>
-      <w:r>
-        <w:t xml:space="preserve">). The associated</w:t>
+        <w:t xml:space="preserve">0.463 for HET-LITE, and 0.488 for HET (Table 6). The associated</w:t>
       </w:r>
       <w:r>
         <w:t xml:space="preserve"> </w:t>
@@ -9208,6 +9119,15 @@
       <w:pPr>
         <w:pStyle w:val="TableCaption"/>
       </w:pPr>
+      <w:r>
+        <w:rPr>
+          <w:b/>
+        </w:rPr>
+        <w:t xml:space="preserve">TABLE 6.</w:t>
+      </w:r>
+      <w:r>
+        <w:t xml:space="preserve"> </w:t>
+      </w:r>
       <w:r>
         <w:t xml:space="preserve">Accuracy proxy (SECONDARY; underpowered by design). Hit-rate of</w:t>
       </w:r>
@@ -9223,7 +9143,7 @@
         <w:tblStyle w:val="Table"/>
         <w:tblW w:type="pct" w:w="0.0"/>
         <w:tblLook w:firstRow="1"/>
-        <w:tblCaption w:val="Accuracy proxy (SECONDARY; underpowered by design). Hit-rate of majority-vote direction vs. 20-day forward-return sign; HOLD abstains."/>
+        <w:tblCaption w:val="TABLE 6. Accuracy proxy (SECONDARY; underpowered by design). Hit-rate of majority-vote direction vs. 20-day forward-return sign; HOLD abstains."/>
       </w:tblPr>
       <w:tblGrid/>
       <w:tr>
@@ -9579,18 +9499,7 @@
         <w:t xml:space="preserve"> </w:t>
       </w:r>
       <w:r>
-        <w:t xml:space="preserve">(Table </w:t>
-      </w:r>
-      <w:hyperlink w:anchor="tab:consensus">
-        <w:r>
-          <w:rPr>
-            <w:rStyle w:val="Hyperlink"/>
-          </w:rPr>
-          <w:t xml:space="preserve">7</w:t>
-        </w:r>
-      </w:hyperlink>
-      <w:r>
-        <w:t xml:space="preserve">).</w:t>
+        <w:t xml:space="preserve">(Table 7).</w:t>
       </w:r>
     </w:p>
     <w:p>
@@ -9785,18 +9694,7 @@
         <w:t xml:space="preserve"> </w:t>
       </w:r>
       <w:r>
-        <w:t xml:space="preserve">per-agent directional accuracy in any configuration (Fig. </w:t>
-      </w:r>
-      <w:hyperlink w:anchor="fig:cal">
-        <w:r>
-          <w:rPr>
-            <w:rStyle w:val="Hyperlink"/>
-          </w:rPr>
-          <w:t xml:space="preserve">4</w:t>
-        </w:r>
-      </w:hyperlink>
-      <w:r>
-        <w:t xml:space="preserve">).</w:t>
+        <w:t xml:space="preserve">per-agent directional accuracy in any configuration (Fig. 5).</w:t>
       </w:r>
       <w:r>
         <w:t xml:space="preserve"> </w:t>
@@ -9840,6 +9738,15 @@
       <w:pPr>
         <w:pStyle w:val="TableCaption"/>
       </w:pPr>
+      <w:r>
+        <w:rPr>
+          <w:b/>
+        </w:rPr>
+        <w:t xml:space="preserve">TABLE 7.</w:t>
+      </w:r>
+      <w:r>
+        <w:t xml:space="preserve"> </w:t>
+      </w:r>
       <w:r>
         <w:t xml:space="preserve">Consensus structure by heterogeneity (exploratory; 3</w:t>
       </w:r>
@@ -10155,7 +10062,7 @@
         <w:tblStyle w:val="Table"/>
         <w:tblW w:type="pct" w:w="0.0"/>
         <w:tblLook w:firstRow="1"/>
-        <w:tblCaption w:val="Consensus structure by heterogeneity (exploratory; 3,600 scoreable five-agent decisions per config). “Unan. wrong” = all five agents agree on one directional call that is wrong; “pile-on” = P(\mathrm{agent\ endorses\ majority}\mid\mathrm{majority\ wrong})."/>
+        <w:tblCaption w:val="TABLE 7. Consensus structure by heterogeneity (exploratory; 3,600 scoreable five-agent decisions per config). “Unan. wrong” = all five agents agree on one directional call that is wrong; “pile-on” = P(\mathrm{agent\ endorses\ majority}\mid\mathrm{majority\ wrong})."/>
       </w:tblPr>
       <w:tblGrid/>
       <w:tr>
@@ -10381,7 +10288,7 @@
           <wp:inline>
             <wp:extent cx="4572000" cy="2926080"/>
             <wp:effectExtent b="0" l="0" r="0" t="0"/>
-            <wp:docPr descr="Self-reported conviction does not predict directional accuracy. Per-agent directional hit-rate by self-reported conviction bucket; no configuration rises reliably above chance (0.5, dashed), consistent with the secondary directional-accuracy analysis." title="" id="1" name="Picture"/>
+            <wp:docPr descr="FIGURE 5. Self-reported conviction does not predict directional accuracy. Per-agent directional hit-rate by self-reported conviction bucket; no configuration rises reliably above chance (0.5, dashed), consistent with the secondary directional-accuracy analysis." title="" id="1" name="Picture"/>
             <a:graphic>
               <a:graphicData uri="http://schemas.openxmlformats.org/drawingml/2006/picture">
                 <pic:pic>
@@ -10424,6 +10331,15 @@
       <w:pPr>
         <w:pStyle w:val="ImageCaption"/>
       </w:pPr>
+      <w:r>
+        <w:rPr>
+          <w:b/>
+        </w:rPr>
+        <w:t xml:space="preserve">FIGURE 5.</w:t>
+      </w:r>
+      <w:r>
+        <w:t xml:space="preserve"> </w:t>
+      </w:r>
       <w:r>
         <w:t xml:space="preserve">Self-reported conviction does not predict directional accuracy.</w:t>
       </w:r>
@@ -11175,18 +11091,7 @@
         <w:t xml:space="preserve"> </w:t>
       </w:r>
       <w:r>
-        <w:t xml:space="preserve">95% confidence intervals excluding zero in each case (Table </w:t>
-      </w:r>
-      <w:hyperlink w:anchor="tab:temp">
-        <w:r>
-          <w:rPr>
-            <w:rStyle w:val="Hyperlink"/>
-          </w:rPr>
-          <w:t xml:space="preserve">8</w:t>
-        </w:r>
-      </w:hyperlink>
-      <w:r>
-        <w:t xml:space="preserve">).</w:t>
+        <w:t xml:space="preserve">95% confidence intervals excluding zero in each case (Table 8).</w:t>
       </w:r>
       <w:r>
         <w:t xml:space="preserve"> </w:t>
@@ -11473,6 +11378,15 @@
       <w:pPr>
         <w:pStyle w:val="TableCaption"/>
       </w:pPr>
+      <w:r>
+        <w:rPr>
+          <w:b/>
+        </w:rPr>
+        <w:t xml:space="preserve">TABLE 8.</w:t>
+      </w:r>
+      <w:r>
+        <w:t xml:space="preserve"> </w:t>
+      </w:r>
       <w:r>
         <w:t xml:space="preserve">Temperature-sensitivity robustness (</w:t>
       </w:r>
@@ -11725,7 +11639,7 @@
         <w:tblStyle w:val="Table"/>
         <w:tblW w:type="pct" w:w="0.0"/>
         <w:tblLook w:firstRow="1"/>
-        <w:tblCaption w:val="Temperature-sensitivity robustness (8\times 2 subgrid, 3 runs per cell). The ordering (\kappa_{\mathrm{HOM}}&gt;\kappa_{\mathrm{HET\text{-}LITE}}&gt;\kappa_{\mathrm{HET}}) and the primary contrast \Delta\kappa_{\mathrm{HOM-HET}} (positive, CI excludes 0) hold at every temperature; absolute \kappa levels vary non-monotonically, so it is the contrast, not the absolute agreement, that is temperature-stable."/>
+        <w:tblCaption w:val="TABLE 8. Temperature-sensitivity robustness (8\times 2 subgrid, 3 runs per cell). The ordering (\kappa_{\mathrm{HOM}}&gt;\kappa_{\mathrm{HET\text{-}LITE}}&gt;\kappa_{\mathrm{HET}}) and the primary contrast \Delta\kappa_{\mathrm{HOM-HET}} (positive, CI excludes 0) hold at every temperature; absolute \kappa levels vary non-monotonically, so it is the contrast, not the absolute agreement, that is temperature-stable."/>
       </w:tblPr>
       <w:tblGrid/>
       <w:tr>
@@ -12629,18 +12543,7 @@
         <w:t xml:space="preserve"> </w:t>
       </w:r>
       <w:r>
-        <w:t xml:space="preserve">the provider-pair matrix (Fig. </w:t>
-      </w:r>
-      <w:hyperlink w:anchor="fig:provider">
-        <w:r>
-          <w:rPr>
-            <w:rStyle w:val="Hyperlink"/>
-          </w:rPr>
-          <w:t xml:space="preserve">3</w:t>
-        </w:r>
-      </w:hyperlink>
-      <w:r>
-        <w:t xml:space="preserve">) compares agents evaluating</w:t>
+        <w:t xml:space="preserve">the provider-pair matrix (Fig. 4) compares agents evaluating</w:t>
       </w:r>
       <w:r>
         <w:t xml:space="preserve"> </w:t>
@@ -12696,18 +12599,7 @@
         <w:t xml:space="preserve"> </w:t>
       </w:r>
       <w:r>
-        <w:t xml:space="preserve">control (Section </w:t>
-      </w:r>
-      <w:hyperlink w:anchor="sec:control">
-        <w:r>
-          <w:rPr>
-            <w:rStyle w:val="Hyperlink"/>
-          </w:rPr>
-          <w:t xml:space="preserve">5.8</w:t>
-        </w:r>
-      </w:hyperlink>
-      <w:r>
-        <w:t xml:space="preserve">) holds model tier approximately constant</w:t>
+        <w:t xml:space="preserve">control (Section V-H) holds model tier approximately constant</w:t>
       </w:r>
       <w:r>
         <w:t xml:space="preserve"> </w:t>

</xml_diff>